<commit_message>
📝 Find Specific Approach
Found a specific solution approach for the problem/research questions: time-aware regression (XGBoost vs a baseline model)
</commit_message>
<xml_diff>
--- a/docs/Supervisor Meetings/Meeting 16.04.docx
+++ b/docs/Supervisor Meetings/Meeting 16.04.docx
@@ -28,7 +28,25 @@
           <w:bCs/>
           <w:lang w:val="en-US"/>
         </w:rPr>
-        <w:t>This form must be completed by the student, approved, and signed by the supervisor on each meeting, then uploaded to GitLab to create a timestamp.</w:t>
+        <w:t xml:space="preserve">This form must be completed by the student, approved, and signed by the supervisor </w:t>
+      </w:r>
+      <w:proofErr w:type="gramStart"/>
+      <w:r>
+        <w:rPr>
+          <w:b/>
+          <w:bCs/>
+          <w:lang w:val="en-US"/>
+        </w:rPr>
+        <w:t>on</w:t>
+      </w:r>
+      <w:proofErr w:type="gramEnd"/>
+      <w:r>
+        <w:rPr>
+          <w:b/>
+          <w:bCs/>
+          <w:lang w:val="en-US"/>
+        </w:rPr>
+        <w:t xml:space="preserve"> each meeting, then uploaded to GitLab to create a timestamp.</w:t>
       </w:r>
     </w:p>
     <w:p>
@@ -138,7 +156,23 @@
         <w:t>Progress Update:</w:t>
       </w:r>
       <w:r>
-        <w:t xml:space="preserve"> [Brief summary]</w:t>
+        <w:t xml:space="preserve"> </w:t>
+      </w:r>
+      <w:r>
+        <w:t xml:space="preserve">explained where </w:t>
+      </w:r>
+      <w:r>
+        <w:rPr>
+          <w:i/>
+          <w:iCs/>
+        </w:rPr>
+        <w:t>popularity</w:t>
+      </w:r>
+      <w:r>
+        <w:t xml:space="preserve"> comes from</w:t>
+      </w:r>
+      <w:r>
+        <w:t>, found a specific approach</w:t>
       </w:r>
     </w:p>
     <w:p>

</xml_diff>